<commit_message>
Update thesis draft (Projektarbeit_Entwurf_yutong.docx)
</commit_message>
<xml_diff>
--- a/thesis/Projektarbeit_Entwurf_yutong.docx
+++ b/thesis/Projektarbeit_Entwurf_yutong.docx
@@ -323,7 +323,7 @@
           <w:noProof/>
         </w:rPr>
         <w:drawing>
-          <wp:anchor distT="0" distB="0" distL="114300" distR="114300" simplePos="0" relativeHeight="251661824" behindDoc="0" locked="0" layoutInCell="1" allowOverlap="1" wp14:anchorId="4A837BDE" wp14:editId="3342E9E0">
+          <wp:anchor distT="0" distB="0" distL="114300" distR="114300" simplePos="0" relativeHeight="251661824" behindDoc="0" locked="0" layoutInCell="1" allowOverlap="1" wp14:anchorId="4A837BDE" wp14:editId="39899AEB">
             <wp:simplePos x="0" y="0"/>
             <wp:positionH relativeFrom="column">
               <wp:posOffset>22748</wp:posOffset>
@@ -5860,14 +5860,13 @@
           <w:noProof/>
           <w:kern w:val="2"/>
           <w:sz w:val="22"/>
-          <w:lang w:val="en-US" w:eastAsia="zh-CN"/>
+          <w:lang w:eastAsia="zh-CN"/>
           <w14:ligatures w14:val="standardContextual"/>
         </w:rPr>
       </w:pPr>
       <w:r>
         <w:rPr>
           <w:noProof/>
-          <w:lang w:val="en-US"/>
         </w:rPr>
         <w:t>Anhang A</w:t>
       </w:r>
@@ -5926,7 +5925,7 @@
           <w:noProof/>
           <w:kern w:val="2"/>
           <w:sz w:val="22"/>
-          <w:lang w:val="en-US" w:eastAsia="zh-CN"/>
+          <w:lang w:eastAsia="zh-CN"/>
           <w14:ligatures w14:val="standardContextual"/>
         </w:rPr>
       </w:pPr>
@@ -6229,7 +6228,7 @@
         <w:rPr>
           <w:noProof/>
         </w:rPr>
-        <w:instrText xml:space="preserve"> PAGEREF _Toc238427407 \h </w:instrText>
+        <w:instrText xml:space="preserve"> PAGEREF _Toc238472610 \h </w:instrText>
       </w:r>
       <w:r>
         <w:rPr>
@@ -6300,7 +6299,7 @@
         <w:rPr>
           <w:noProof/>
         </w:rPr>
-        <w:instrText xml:space="preserve"> PAGEREF _Toc238427408 \h </w:instrText>
+        <w:instrText xml:space="preserve"> PAGEREF _Toc238472611 \h </w:instrText>
       </w:r>
       <w:r>
         <w:rPr>
@@ -6355,7 +6354,15 @@
           <w:noProof/>
           <w:lang w:val="en-US"/>
         </w:rPr>
-        <w:t>: RiskScore-Berechnung der Long Harbour Processing Plant (Vale Canada Ltd.</w:t>
+        <w:t>: RiskScore-Berechnung der Long Harbour Processing Plant (Vale Canada Ltd</w:t>
+      </w:r>
+      <w:r>
+        <w:rPr>
+          <w:iCs/>
+          <w:noProof/>
+          <w:lang w:val="en-US" w:eastAsia="zh-CN"/>
+        </w:rPr>
+        <w:t>)</w:t>
       </w:r>
       <w:r>
         <w:rPr>
@@ -6375,7 +6382,7 @@
           <w:noProof/>
           <w:lang w:val="en-US"/>
         </w:rPr>
-        <w:instrText xml:space="preserve"> PAGEREF _Toc238427409 \h </w:instrText>
+        <w:instrText xml:space="preserve"> PAGEREF _Toc238472612 \h </w:instrText>
       </w:r>
       <w:r>
         <w:rPr>
@@ -6447,7 +6454,7 @@
         <w:rPr>
           <w:noProof/>
         </w:rPr>
-        <w:instrText xml:space="preserve"> PAGEREF _Toc238427410 \h </w:instrText>
+        <w:instrText xml:space="preserve"> PAGEREF _Toc238472613 \h </w:instrText>
       </w:r>
       <w:r>
         <w:rPr>
@@ -6464,7 +6471,7 @@
         <w:rPr>
           <w:noProof/>
         </w:rPr>
-        <w:t>30</w:t>
+        <w:t>29</w:t>
       </w:r>
       <w:r>
         <w:rPr>
@@ -6508,7 +6515,7 @@
           <w:noProof/>
           <w:lang w:eastAsia="zh-CN"/>
         </w:rPr>
-        <w:t xml:space="preserve"> Qualitätsbewertung der Szenarien S1 bis S4 (jeweils ein abschließender Durchlauf)</w:t>
+        <w:t xml:space="preserve"> Durchschnittliche Qualitätsbewertung der Szenarien S1 bis S4 über zehn Wiederholungen</w:t>
       </w:r>
       <w:r>
         <w:rPr>
@@ -6526,7 +6533,7 @@
         <w:rPr>
           <w:noProof/>
         </w:rPr>
-        <w:instrText xml:space="preserve"> PAGEREF _Toc238427411 \h </w:instrText>
+        <w:instrText xml:space="preserve"> PAGEREF _Toc238472614 \h </w:instrText>
       </w:r>
       <w:r>
         <w:rPr>
@@ -7142,7 +7149,6 @@
       <w:pPr>
         <w:pStyle w:val="2"/>
         <w:rPr>
-          <w:rFonts w:hint="eastAsia"/>
           <w:lang w:eastAsia="zh-CN"/>
         </w:rPr>
       </w:pPr>
@@ -7212,7 +7218,6 @@
     <w:p>
       <w:pPr>
         <w:rPr>
-          <w:rFonts w:hint="eastAsia"/>
           <w:lang w:eastAsia="zh-CN"/>
         </w:rPr>
       </w:pPr>
@@ -7226,25 +7231,7 @@
         <w:fldChar w:fldCharType="separate"/>
       </w:r>
       <w:r>
-        <w:t>A</w:t>
-      </w:r>
-      <w:r>
-        <w:t>b</w:t>
-      </w:r>
-      <w:r>
-        <w:t>bild</w:t>
-      </w:r>
-      <w:r>
-        <w:t>u</w:t>
-      </w:r>
-      <w:r>
-        <w:t>n</w:t>
-      </w:r>
-      <w:r>
-        <w:t>g</w:t>
-      </w:r>
-      <w:r>
-        <w:t xml:space="preserve"> </w:t>
+        <w:t xml:space="preserve">Abbildung </w:t>
       </w:r>
       <w:r>
         <w:rPr>
@@ -7326,7 +7313,6 @@
       <w:pPr>
         <w:pStyle w:val="a6"/>
         <w:rPr>
-          <w:rFonts w:hint="eastAsia"/>
           <w:lang w:eastAsia="zh-CN"/>
         </w:rPr>
       </w:pPr>
@@ -7337,27 +7323,14 @@
       <w:r>
         <w:t xml:space="preserve">Abbildung </w:t>
       </w:r>
-      <w:r>
-        <w:fldChar w:fldCharType="begin"/>
-      </w:r>
-      <w:r>
-        <w:instrText xml:space="preserve"> SEQ Abbildung \* ARABIC </w:instrText>
-      </w:r>
-      <w:r>
-        <w:fldChar w:fldCharType="separate"/>
-      </w:r>
-      <w:r>
-        <w:rPr>
-          <w:noProof/>
-        </w:rPr>
-        <w:t>1</w:t>
-      </w:r>
-      <w:r>
-        <w:rPr>
-          <w:noProof/>
-        </w:rPr>
-        <w:fldChar w:fldCharType="end"/>
-      </w:r>
+      <w:fldSimple w:instr=" SEQ Abbildung \* ARABIC ">
+        <w:r>
+          <w:rPr>
+            <w:noProof/>
+          </w:rPr>
+          <w:t>1</w:t>
+        </w:r>
+      </w:fldSimple>
       <w:bookmarkEnd w:id="16"/>
       <w:r>
         <w:t xml:space="preserve">: </w:t>
@@ -7383,7 +7356,6 @@
     <w:p>
       <w:pPr>
         <w:rPr>
-          <w:rFonts w:hint="eastAsia"/>
           <w:lang w:eastAsia="zh-CN"/>
         </w:rPr>
       </w:pPr>
@@ -7476,37 +7448,27 @@
         <w:pStyle w:val="a6"/>
         <w:jc w:val="left"/>
       </w:pPr>
-      <w:bookmarkStart w:id="21" w:name="_Toc238424242"/>
-      <w:bookmarkStart w:id="22" w:name="_Ref238424257"/>
+      <w:bookmarkStart w:id="21" w:name="_Ref238424257"/>
+      <w:bookmarkStart w:id="22" w:name="_Toc238424242"/>
       <w:r>
         <w:t xml:space="preserve">Abbildung </w:t>
       </w:r>
-      <w:r>
-        <w:fldChar w:fldCharType="begin"/>
-      </w:r>
-      <w:r>
-        <w:instrText xml:space="preserve"> SEQ Abbildung \* ARABIC </w:instrText>
-      </w:r>
-      <w:r>
-        <w:fldChar w:fldCharType="separate"/>
-      </w:r>
-      <w:r>
-        <w:rPr>
-          <w:noProof/>
-        </w:rPr>
-        <w:t>2</w:t>
-      </w:r>
-      <w:r>
-        <w:fldChar w:fldCharType="end"/>
+      <w:fldSimple w:instr=" SEQ Abbildung \* ARABIC ">
+        <w:r>
+          <w:rPr>
+            <w:noProof/>
+          </w:rPr>
+          <w:t>2</w:t>
+        </w:r>
+      </w:fldSimple>
+      <w:bookmarkEnd w:id="21"/>
+      <w:r>
+        <w:rPr>
+          <w:iCs/>
+        </w:rPr>
+        <w:t>: Ablaufdiagramm der sechsstufigen Agenten-Pipeline.</w:t>
       </w:r>
       <w:bookmarkEnd w:id="22"/>
-      <w:r>
-        <w:rPr>
-          <w:iCs/>
-        </w:rPr>
-        <w:t>: Ablaufdiagramm der sechsstufigen Agenten-Pipeline.</w:t>
-      </w:r>
-      <w:bookmarkEnd w:id="21"/>
     </w:p>
     <w:p>
       <w:r>
@@ -7958,33 +7920,22 @@
         <w:pStyle w:val="a6"/>
         <w:keepNext/>
         <w:rPr>
-          <w:rFonts w:hint="eastAsia"/>
           <w:lang w:eastAsia="zh-CN"/>
         </w:rPr>
       </w:pPr>
       <w:bookmarkStart w:id="39" w:name="_Ref238424249"/>
-      <w:bookmarkStart w:id="40" w:name="_Toc238427407"/>
+      <w:bookmarkStart w:id="40" w:name="_Toc238472610"/>
       <w:r>
         <w:t xml:space="preserve">Tabelle </w:t>
       </w:r>
-      <w:r>
-        <w:fldChar w:fldCharType="begin"/>
-      </w:r>
-      <w:r>
-        <w:instrText xml:space="preserve"> SEQ Tabelle \* ARABIC </w:instrText>
-      </w:r>
-      <w:r>
-        <w:fldChar w:fldCharType="separate"/>
-      </w:r>
-      <w:r>
-        <w:rPr>
-          <w:noProof/>
-        </w:rPr>
-        <w:t>1</w:t>
-      </w:r>
-      <w:r>
-        <w:fldChar w:fldCharType="end"/>
-      </w:r>
+      <w:fldSimple w:instr=" SEQ Tabelle \* ARABIC ">
+        <w:r>
+          <w:rPr>
+            <w:noProof/>
+          </w:rPr>
+          <w:t>1</w:t>
+        </w:r>
+      </w:fldSimple>
       <w:bookmarkEnd w:id="39"/>
       <w:r>
         <w:t>: Technologie-Stack der Implementierung</w:t>
@@ -8428,7 +8379,6 @@
     <w:p>
       <w:pPr>
         <w:rPr>
-          <w:rFonts w:hint="eastAsia"/>
           <w:lang w:eastAsia="zh-CN"/>
         </w:rPr>
       </w:pPr>
@@ -8445,13 +8395,7 @@
         <w:fldChar w:fldCharType="separate"/>
       </w:r>
       <w:r>
-        <w:t>Tab</w:t>
-      </w:r>
-      <w:r>
-        <w:t>e</w:t>
-      </w:r>
-      <w:r>
-        <w:t xml:space="preserve">lle </w:t>
+        <w:t xml:space="preserve">Tabelle </w:t>
       </w:r>
       <w:r>
         <w:rPr>
@@ -8472,28 +8416,18 @@
         <w:keepNext/>
       </w:pPr>
       <w:bookmarkStart w:id="45" w:name="_Ref238424250"/>
-      <w:bookmarkStart w:id="46" w:name="_Toc238427408"/>
+      <w:bookmarkStart w:id="46" w:name="_Toc238472611"/>
       <w:r>
         <w:t xml:space="preserve">Tabelle </w:t>
       </w:r>
-      <w:r>
-        <w:fldChar w:fldCharType="begin"/>
-      </w:r>
-      <w:r>
-        <w:instrText xml:space="preserve"> SEQ Tabelle \* ARABIC </w:instrText>
-      </w:r>
-      <w:r>
-        <w:fldChar w:fldCharType="separate"/>
-      </w:r>
-      <w:r>
-        <w:rPr>
-          <w:noProof/>
-        </w:rPr>
-        <w:t>2</w:t>
-      </w:r>
-      <w:r>
-        <w:fldChar w:fldCharType="end"/>
-      </w:r>
+      <w:fldSimple w:instr=" SEQ Tabelle \* ARABIC ">
+        <w:r>
+          <w:rPr>
+            <w:noProof/>
+          </w:rPr>
+          <w:t>2</w:t>
+        </w:r>
+      </w:fldSimple>
       <w:bookmarkEnd w:id="45"/>
       <w:r>
         <w:rPr>
@@ -8756,7 +8690,7 @@
           <w:p>
             <w:pPr>
               <w:rPr>
-                <w:rFonts w:ascii="Cambria Math" w:hAnsi="Cambria Math" w:hint="eastAsia"/>
+                <w:rFonts w:ascii="Cambria Math" w:hAnsi="Cambria Math"/>
                 <w:lang w:eastAsia="zh-CN"/>
                 <w:oMath/>
               </w:rPr>
@@ -8842,7 +8776,6 @@
           <w:p>
             <w:pPr>
               <w:rPr>
-                <w:rFonts w:hint="eastAsia"/>
                 <w:i/>
                 <w:lang w:eastAsia="zh-CN"/>
               </w:rPr>
@@ -8922,14 +8855,7 @@
                     <w:rFonts w:ascii="Cambria Math" w:hAnsi="Cambria Math"/>
                     <w:lang w:eastAsia="zh-CN"/>
                   </w:rPr>
-                  <m:t xml:space="preserve"> × 10</m:t>
-                </m:r>
-                <m:r>
-                  <w:rPr>
-                    <w:rFonts w:ascii="Cambria Math" w:hAnsi="Cambria Math"/>
-                    <w:lang w:eastAsia="zh-CN"/>
-                  </w:rPr>
-                  <m:t>0</m:t>
+                  <m:t xml:space="preserve"> × 100</m:t>
                 </m:r>
               </m:oMath>
             </m:oMathPara>
@@ -9049,7 +8975,6 @@
           <w:p>
             <w:pPr>
               <w:rPr>
-                <w:rFonts w:hint="eastAsia"/>
                 <w:iCs/>
                 <w:lang w:eastAsia="zh-CN"/>
               </w:rPr>
@@ -9099,7 +9024,6 @@
           <w:p>
             <w:pPr>
               <w:rPr>
-                <w:rFonts w:hint="eastAsia"/>
                 <w:iCs/>
                 <w:lang w:eastAsia="zh-CN"/>
               </w:rPr>
@@ -9171,7 +9095,6 @@
           <w:p>
             <w:pPr>
               <w:rPr>
-                <w:rFonts w:hint="eastAsia"/>
                 <w:iCs/>
                 <w:lang w:eastAsia="zh-CN"/>
               </w:rPr>
@@ -9213,7 +9136,6 @@
           <w:p>
             <w:pPr>
               <w:rPr>
-                <w:rFonts w:hint="eastAsia"/>
                 <w:i/>
                 <w:lang w:eastAsia="zh-CN"/>
               </w:rPr>
@@ -9328,21 +9250,7 @@
                     <w:rFonts w:ascii="Cambria Math" w:hAnsi="Cambria Math" w:cs="Arial"/>
                     <w:lang w:eastAsia="zh-CN"/>
                   </w:rPr>
-                  <m:t xml:space="preserve">Vulnerability= 0,30 · ImportDep </m:t>
-                </m:r>
-                <m:r>
-                  <w:rPr>
-                    <w:rFonts w:ascii="Cambria Math" w:hAnsi="Cambria Math" w:cs="Arial"/>
-                    <w:lang w:eastAsia="zh-CN"/>
-                  </w:rPr>
-                  <m:t>+</m:t>
-                </m:r>
-                <m:r>
-                  <w:rPr>
-                    <w:rFonts w:ascii="Cambria Math" w:hAnsi="Cambria Math" w:cs="Arial"/>
-                    <w:lang w:eastAsia="zh-CN"/>
-                  </w:rPr>
-                  <m:t xml:space="preserve">0,30 · SupplierConc </m:t>
+                  <m:t xml:space="preserve">Vulnerability= 0,30 · ImportDep +0,30 · SupplierConc </m:t>
                 </m:r>
               </m:oMath>
             </m:oMathPara>
@@ -9352,7 +9260,6 @@
               <w:keepNext/>
               <w:jc w:val="left"/>
               <w:rPr>
-                <w:rFonts w:hint="eastAsia"/>
                 <w:lang w:eastAsia="zh-CN"/>
               </w:rPr>
             </w:pPr>
@@ -9363,21 +9270,7 @@
                     <w:rFonts w:ascii="Cambria Math" w:hAnsi="Cambria Math" w:cs="Arial"/>
                     <w:lang w:eastAsia="zh-CN"/>
                   </w:rPr>
-                  <m:t>+ 0,25 · SingleSourceDep</m:t>
-                </m:r>
-                <m:r>
-                  <w:rPr>
-                    <w:rFonts w:ascii="Cambria Math" w:hAnsi="Cambria Math" w:cs="Arial"/>
-                    <w:lang w:eastAsia="zh-CN"/>
-                  </w:rPr>
-                  <m:t xml:space="preserve"> </m:t>
-                </m:r>
-                <m:r>
-                  <w:rPr>
-                    <w:rFonts w:ascii="Cambria Math" w:hAnsi="Cambria Math" w:cs="Arial"/>
-                    <w:lang w:eastAsia="zh-CN"/>
-                  </w:rPr>
-                  <m:t>+ 0,15 · LeadTimeNorm</m:t>
+                  <m:t>+ 0,25 · SingleSourceDep + 0,15 · LeadTimeNorm</m:t>
                 </m:r>
               </m:oMath>
             </m:oMathPara>
@@ -9610,7 +9503,6 @@
           <w:p>
             <w:pPr>
               <w:rPr>
-                <w:rFonts w:hint="eastAsia"/>
                 <w:iCs/>
                 <w:lang w:eastAsia="zh-CN"/>
               </w:rPr>
@@ -9743,7 +9635,7 @@
               <w:keepNext/>
               <w:jc w:val="center"/>
               <w:rPr>
-                <w:rFonts w:ascii="Cambria Math" w:hAnsi="Cambria Math" w:hint="eastAsia"/>
+                <w:rFonts w:ascii="Cambria Math" w:hAnsi="Cambria Math"/>
                 <w:i/>
                 <w:lang w:eastAsia="zh-CN"/>
               </w:rPr>
@@ -9975,14 +9867,7 @@
           <w:rFonts w:hint="eastAsia"/>
           <w:lang w:eastAsia="zh-CN"/>
         </w:rPr>
-        <w:t xml:space="preserve"> </w:t>
-      </w:r>
-      <w:r>
-        <w:rPr>
-          <w:rFonts w:hint="eastAsia"/>
-          <w:lang w:eastAsia="zh-CN"/>
-        </w:rPr>
-        <w:t>z</w:t>
+        <w:t xml:space="preserve"> z</w:t>
       </w:r>
       <w:r>
         <w:t>eigt die vollständige Berechnung am Beispiel der am stärksten betroffenen Anlage aus Szenario S1 (Abschnitt 5.2).</w:t>
@@ -9993,12 +9878,11 @@
         <w:pStyle w:val="a6"/>
         <w:keepNext/>
         <w:rPr>
-          <w:rFonts w:hint="eastAsia"/>
           <w:lang w:val="en-US" w:eastAsia="zh-CN"/>
         </w:rPr>
       </w:pPr>
       <w:bookmarkStart w:id="52" w:name="_Ref238424252"/>
-      <w:bookmarkStart w:id="53" w:name="_Toc238427409"/>
+      <w:bookmarkStart w:id="53" w:name="_Toc238472612"/>
       <w:r>
         <w:rPr>
           <w:lang w:val="en-US"/>
@@ -10753,28 +10637,18 @@
         <w:keepNext/>
       </w:pPr>
       <w:bookmarkStart w:id="62" w:name="_Ref238424253"/>
-      <w:bookmarkStart w:id="63" w:name="_Toc238427410"/>
+      <w:bookmarkStart w:id="63" w:name="_Toc238472613"/>
       <w:r>
         <w:t xml:space="preserve">Tabelle </w:t>
       </w:r>
-      <w:r>
-        <w:fldChar w:fldCharType="begin"/>
-      </w:r>
-      <w:r>
-        <w:instrText xml:space="preserve"> SEQ Tabelle \* ARABIC </w:instrText>
-      </w:r>
-      <w:r>
-        <w:fldChar w:fldCharType="separate"/>
-      </w:r>
-      <w:r>
-        <w:rPr>
-          <w:noProof/>
-        </w:rPr>
-        <w:t>4</w:t>
-      </w:r>
-      <w:r>
-        <w:fldChar w:fldCharType="end"/>
-      </w:r>
+      <w:fldSimple w:instr=" SEQ Tabelle \* ARABIC ">
+        <w:r>
+          <w:rPr>
+            <w:noProof/>
+          </w:rPr>
+          <w:t>4</w:t>
+        </w:r>
+      </w:fldSimple>
       <w:bookmarkEnd w:id="62"/>
       <w:r>
         <w:rPr>
@@ -11276,33 +11150,20 @@
       <w:pPr>
         <w:pStyle w:val="a6"/>
         <w:keepNext/>
-        <w:rPr>
-          <w:rFonts w:hint="eastAsia"/>
-        </w:rPr>
       </w:pPr>
       <w:bookmarkStart w:id="66" w:name="_Ref238424254"/>
-      <w:bookmarkStart w:id="67" w:name="_Toc238427411"/>
+      <w:bookmarkStart w:id="67" w:name="_Toc238472614"/>
       <w:r>
         <w:t xml:space="preserve">Tabelle </w:t>
       </w:r>
-      <w:r>
-        <w:fldChar w:fldCharType="begin"/>
-      </w:r>
-      <w:r>
-        <w:instrText xml:space="preserve"> SEQ Tabelle \* ARABIC </w:instrText>
-      </w:r>
-      <w:r>
-        <w:fldChar w:fldCharType="separate"/>
-      </w:r>
-      <w:r>
-        <w:rPr>
-          <w:noProof/>
-        </w:rPr>
-        <w:t>5</w:t>
-      </w:r>
-      <w:r>
-        <w:fldChar w:fldCharType="end"/>
-      </w:r>
+      <w:fldSimple w:instr=" SEQ Tabelle \* ARABIC ">
+        <w:r>
+          <w:rPr>
+            <w:noProof/>
+          </w:rPr>
+          <w:t>5</w:t>
+        </w:r>
+      </w:fldSimple>
       <w:bookmarkEnd w:id="66"/>
       <w:r>
         <w:rPr>
@@ -11317,14 +11178,14 @@
         </w:rPr>
         <w:t xml:space="preserve"> </w:t>
       </w:r>
+      <w:r>
+        <w:rPr>
+          <w:iCs/>
+          <w:lang w:eastAsia="zh-CN"/>
+        </w:rPr>
+        <w:t>Durchschnittliche Qualitätsbewertung der Szenarien S1 bis S4 über zehn Wiederholungen</w:t>
+      </w:r>
       <w:bookmarkEnd w:id="67"/>
-      <w:r>
-        <w:rPr>
-          <w:iCs/>
-          <w:lang w:eastAsia="zh-CN"/>
-        </w:rPr>
-        <w:t>Durchschnittliche Qualitätsbewertung der Szenarien S1 bis S4 über zehn Wiederholungen</w:t>
-      </w:r>
     </w:p>
     <w:tbl>
       <w:tblPr>
@@ -13229,7 +13090,7 @@
         <w:rFonts w:cs="Arial"/>
         <w:noProof/>
       </w:rPr>
-      <w:t>Abkürzungsverzeichnis</w:t>
+      <w:t>Tabellenverzeichnis</w:t>
     </w:r>
     <w:r>
       <w:rPr>
@@ -13453,7 +13314,7 @@
         <w:bCs/>
         <w:noProof/>
       </w:rPr>
-      <w:t>Literaturverzeichnis</w:t>
+      <w:t>Anhang B</w:t>
     </w:r>
     <w:r>
       <w:rPr>

</xml_diff>